<commit_message>
Index Exchange company mode: 7 sequenced, ZI web-app fallback rule added to qualification skill, session notes + test prompt
</commit_message>
<xml_diff>
--- a/NANOG97_LinkedIn_Messages.docx
+++ b/NANOG97_LinkedIn_Messages.docx
@@ -1096,6 +1096,530 @@
           <w:szCs w:val="18"/>
         </w:rPr>
         <w:t xml:space="preserve">172 characters</w:t>
+      </w:r>
+    </w:p>
+    <w:p/>
+    <w:p>
+      <w:r>
+        <w:rPr>
+          <w:b/>
+          <w:color w:val="C00000"/>
+          <w:sz w:val="32"/>
+        </w:rPr>
+        <w:t>--- PENDING APPROVAL: Cold Accounts / Other Reps ---</w:t>
+      </w:r>
+    </w:p>
+    <w:p>
+      <w:r>
+        <w:t>Review each person below and confirm before sending connection requests.</w:t>
+      </w:r>
+    </w:p>
+    <w:p/>
+    <w:p>
+      <w:r>
+        <w:rPr>
+          <w:b/>
+          <w:color w:val="1F497D"/>
+          <w:sz w:val="24"/>
+        </w:rPr>
+        <w:t>ARELION (12 people) -- Tier 1 carrier, other rep owns, cold</w:t>
+      </w:r>
+    </w:p>
+    <w:p>
+      <w:r>
+        <w:rPr>
+          <w:b/>
+        </w:rPr>
+        <w:t>Shahid Ashraf  |  Global Account Director</w:t>
+      </w:r>
+    </w:p>
+    <w:p>
+      <w:r>
+        <w:t>https://www.linkedin.com/in/shahid786</w:t>
+      </w:r>
+    </w:p>
+    <w:p>
+      <w:r>
+        <w:t>Shahid, heading to NANOG 97 in Bellevue next week -- Arelion runs one of the best backbone networks in the game. Grabbing a beer Sunday night before things kick off. Would love to connect.</w:t>
+      </w:r>
+    </w:p>
+    <w:p>
+      <w:r>
+        <w:rPr>
+          <w:i/>
+          <w:sz w:val="18"/>
+        </w:rPr>
+        <w:t>188 characters</w:t>
+      </w:r>
+    </w:p>
+    <w:p>
+      <w:r>
+        <w:rPr>
+          <w:b/>
+        </w:rPr>
+        <w:t>Tony Avino  |  Global Sales Director</w:t>
+      </w:r>
+    </w:p>
+    <w:p>
+      <w:r>
+        <w:t>https://www.linkedin.com/in/tonyavino</w:t>
+      </w:r>
+    </w:p>
+    <w:p>
+      <w:r>
+        <w:t>Tony, heading to NANOG 97 in Bellevue next week -- Arelion runs one of the best backbone networks in the game. Grabbing a beer Sunday night before things kick off. Would love to connect.</w:t>
+      </w:r>
+    </w:p>
+    <w:p>
+      <w:r>
+        <w:rPr>
+          <w:i/>
+          <w:sz w:val="18"/>
+        </w:rPr>
+        <w:t>186 characters</w:t>
+      </w:r>
+    </w:p>
+    <w:p>
+      <w:r>
+        <w:rPr>
+          <w:b/>
+        </w:rPr>
+        <w:t>Wes Cantrall  |  Account Executive</w:t>
+      </w:r>
+    </w:p>
+    <w:p>
+      <w:r>
+        <w:t>https://www.linkedin.com/in/wescantrall</w:t>
+      </w:r>
+    </w:p>
+    <w:p>
+      <w:r>
+        <w:t>Wes, heading to NANOG 97 in Bellevue next week -- Arelion runs one of the best backbone networks in the game. Grabbing a beer Sunday night before things kick off. Would love to connect.</w:t>
+      </w:r>
+    </w:p>
+    <w:p>
+      <w:r>
+        <w:rPr>
+          <w:i/>
+          <w:sz w:val="18"/>
+        </w:rPr>
+        <w:t>185 characters</w:t>
+      </w:r>
+    </w:p>
+    <w:p>
+      <w:r>
+        <w:rPr>
+          <w:b/>
+        </w:rPr>
+        <w:t>Mike Foti  |  International Sales / Business Development</w:t>
+      </w:r>
+    </w:p>
+    <w:p>
+      <w:r>
+        <w:t>https://www.linkedin.com/in/mike-foti-b8422b</w:t>
+      </w:r>
+    </w:p>
+    <w:p>
+      <w:r>
+        <w:t>Mike, heading to NANOG 97 in Bellevue next week -- Arelion runs one of the best backbone networks in the game. Grabbing a beer Sunday night before things kick off. Would love to connect.</w:t>
+      </w:r>
+    </w:p>
+    <w:p>
+      <w:r>
+        <w:rPr>
+          <w:i/>
+          <w:sz w:val="18"/>
+        </w:rPr>
+        <w:t>186 characters</w:t>
+      </w:r>
+    </w:p>
+    <w:p>
+      <w:r>
+        <w:rPr>
+          <w:b/>
+        </w:rPr>
+        <w:t>Erin Geiger  |  Account Director, Carrier/Wholesale/Channel</w:t>
+      </w:r>
+    </w:p>
+    <w:p>
+      <w:r>
+        <w:t>https://www.linkedin.com/in/erinlgeiger</w:t>
+      </w:r>
+    </w:p>
+    <w:p>
+      <w:r>
+        <w:t>Erin, heading to NANOG 97 in Bellevue next week -- Arelion runs one of the best backbone networks in the game. Grabbing a beer Sunday night before things kick off. Would love to connect.</w:t>
+      </w:r>
+    </w:p>
+    <w:p>
+      <w:r>
+        <w:rPr>
+          <w:i/>
+          <w:sz w:val="18"/>
+        </w:rPr>
+        <w:t>186 characters</w:t>
+      </w:r>
+    </w:p>
+    <w:p>
+      <w:r>
+        <w:rPr>
+          <w:b/>
+        </w:rPr>
+        <w:t>Bhawna Jain  |  Manager, Sales Engineering</w:t>
+      </w:r>
+    </w:p>
+    <w:p>
+      <w:r>
+        <w:t>https://www.linkedin.com/in/bhawnaj</w:t>
+      </w:r>
+    </w:p>
+    <w:p>
+      <w:r>
+        <w:t>Bhawna, heading to NANOG 97 in Bellevue next week -- Arelion runs one of the best backbone networks in the game. Grabbing a beer Sunday night before things kick off. Would love to connect.</w:t>
+      </w:r>
+    </w:p>
+    <w:p>
+      <w:r>
+        <w:rPr>
+          <w:i/>
+          <w:sz w:val="18"/>
+        </w:rPr>
+        <w:t>188 characters</w:t>
+      </w:r>
+    </w:p>
+    <w:p>
+      <w:r>
+        <w:rPr>
+          <w:b/>
+        </w:rPr>
+        <w:t>Art Kazmierczak  |  Director Strategic Sales &amp; Network Development</w:t>
+      </w:r>
+    </w:p>
+    <w:p>
+      <w:r>
+        <w:t>https://www.linkedin.com/in/art-kazmierczak-53ba312</w:t>
+      </w:r>
+    </w:p>
+    <w:p>
+      <w:r>
+        <w:t>Art, heading to NANOG 97 in Bellevue next week -- Arelion runs one of the best backbone networks in the game. Grabbing a beer Sunday night before things kick off. Would love to connect.</w:t>
+      </w:r>
+    </w:p>
+    <w:p>
+      <w:r>
+        <w:rPr>
+          <w:i/>
+          <w:sz w:val="18"/>
+        </w:rPr>
+        <w:t>185 characters</w:t>
+      </w:r>
+    </w:p>
+    <w:p>
+      <w:r>
+        <w:rPr>
+          <w:b/>
+        </w:rPr>
+        <w:t>David Kleier  |  Account Executive</w:t>
+      </w:r>
+    </w:p>
+    <w:p>
+      <w:r>
+        <w:t>https://www.linkedin.com/in/davidkleier</w:t>
+      </w:r>
+    </w:p>
+    <w:p>
+      <w:r>
+        <w:t>David, heading to NANOG 97 in Bellevue next week -- Arelion runs one of the best backbone networks in the game. Grabbing a beer Sunday night before things kick off. Would love to connect.</w:t>
+      </w:r>
+    </w:p>
+    <w:p>
+      <w:r>
+        <w:rPr>
+          <w:i/>
+          <w:sz w:val="18"/>
+        </w:rPr>
+        <w:t>187 characters</w:t>
+      </w:r>
+    </w:p>
+    <w:p>
+      <w:r>
+        <w:rPr>
+          <w:b/>
+        </w:rPr>
+        <w:t>CF Lagerfeldt  |  Global Peering Manager</w:t>
+      </w:r>
+    </w:p>
+    <w:p>
+      <w:r>
+        <w:t>https://www.linkedin.com/in/carl-fredrik-lagerfeldt-b8546341</w:t>
+      </w:r>
+    </w:p>
+    <w:p>
+      <w:r>
+        <w:t>CF, heading to NANOG 97 in Bellevue next week -- Arelion runs one of the best backbone networks in the game. Grabbing a beer Sunday night before things kick off. Would love to connect.</w:t>
+      </w:r>
+    </w:p>
+    <w:p>
+      <w:r>
+        <w:rPr>
+          <w:i/>
+          <w:sz w:val="18"/>
+        </w:rPr>
+        <w:t>184 characters</w:t>
+      </w:r>
+    </w:p>
+    <w:p>
+      <w:r>
+        <w:rPr>
+          <w:b/>
+        </w:rPr>
+        <w:t>Aaron Quinn  |  Global Peering Management &amp; Network Strategy</w:t>
+      </w:r>
+    </w:p>
+    <w:p>
+      <w:r>
+        <w:t>https://www.linkedin.com/in/aaron-l-quinn-b61846</w:t>
+      </w:r>
+    </w:p>
+    <w:p>
+      <w:r>
+        <w:t>Aaron, heading to NANOG 97 in Bellevue next week -- Arelion runs one of the best backbone networks in the game. Grabbing a beer Sunday night before things kick off. Would love to connect.</w:t>
+      </w:r>
+    </w:p>
+    <w:p>
+      <w:r>
+        <w:rPr>
+          <w:i/>
+          <w:sz w:val="18"/>
+        </w:rPr>
+        <w:t>187 characters</w:t>
+      </w:r>
+    </w:p>
+    <w:p>
+      <w:r>
+        <w:rPr>
+          <w:b/>
+        </w:rPr>
+        <w:t>Greg Richards  |  Global Digital Infrastructure Sales</w:t>
+      </w:r>
+    </w:p>
+    <w:p>
+      <w:r>
+        <w:t>https://www.linkedin.com/in/greg-richards-b4b9bb</w:t>
+      </w:r>
+    </w:p>
+    <w:p>
+      <w:r>
+        <w:t>Greg, heading to NANOG 97 in Bellevue next week -- Arelion runs one of the best backbone networks in the game. Grabbing a beer Sunday night before things kick off. Would love to connect.</w:t>
+      </w:r>
+    </w:p>
+    <w:p>
+      <w:r>
+        <w:rPr>
+          <w:i/>
+          <w:sz w:val="18"/>
+        </w:rPr>
+        <w:t>186 characters</w:t>
+      </w:r>
+    </w:p>
+    <w:p>
+      <w:r>
+        <w:rPr>
+          <w:b/>
+        </w:rPr>
+        <w:t>Kirk Tracy  |  Global Account Manager, Wholesale Carrier</w:t>
+      </w:r>
+    </w:p>
+    <w:p>
+      <w:r>
+        <w:t>https://www.linkedin.com/in/kirk-tracy-3628621</w:t>
+      </w:r>
+    </w:p>
+    <w:p>
+      <w:r>
+        <w:t>Kirk, heading to NANOG 97 in Bellevue next week -- Arelion runs one of the best backbone networks in the game. Grabbing a beer Sunday night before things kick off. Would love to connect.</w:t>
+      </w:r>
+    </w:p>
+    <w:p>
+      <w:r>
+        <w:rPr>
+          <w:i/>
+          <w:sz w:val="18"/>
+        </w:rPr>
+        <w:t>186 characters</w:t>
+      </w:r>
+    </w:p>
+    <w:p/>
+    <w:p>
+      <w:r>
+        <w:rPr>
+          <w:b/>
+          <w:color w:val="1F497D"/>
+          <w:sz w:val="24"/>
+        </w:rPr>
+        <w:t>SEGRA (6 people) -- fiber carrier, other rep owns, cold</w:t>
+      </w:r>
+    </w:p>
+    <w:p>
+      <w:r>
+        <w:rPr>
+          <w:b/>
+        </w:rPr>
+        <w:t>Micah Crane  |  Fiber Enthusiast / Account Executive</w:t>
+      </w:r>
+    </w:p>
+    <w:p>
+      <w:r>
+        <w:t>https://www.linkedin.com/in/micah-crane-4a2608165</w:t>
+      </w:r>
+    </w:p>
+    <w:p>
+      <w:r>
+        <w:t>Micah, heading to NANOG 97 in Bellevue next week -- Segra's fiber network in the Southeast is exactly the kind of infrastructure conversation NANOG is built for. Grabbing a beer Sunday night before things kick off. Would love to connect.</w:t>
+      </w:r>
+    </w:p>
+    <w:p>
+      <w:r>
+        <w:rPr>
+          <w:i/>
+          <w:sz w:val="18"/>
+        </w:rPr>
+        <w:t>237 characters</w:t>
+      </w:r>
+    </w:p>
+    <w:p>
+      <w:r>
+        <w:rPr>
+          <w:b/>
+        </w:rPr>
+        <w:t>Steve Hartman  |  Wireline and Content Strategic Accounts</w:t>
+      </w:r>
+    </w:p>
+    <w:p>
+      <w:r>
+        <w:t>https://www.linkedin.com/in/stephen-hartman-969375</w:t>
+      </w:r>
+    </w:p>
+    <w:p>
+      <w:r>
+        <w:t>Steve, heading to NANOG 97 in Bellevue next week -- Segra's fiber network in the Southeast is exactly the kind of infrastructure conversation NANOG is built for. Grabbing a beer Sunday night before things kick off. Would love to connect.</w:t>
+      </w:r>
+    </w:p>
+    <w:p>
+      <w:r>
+        <w:rPr>
+          <w:i/>
+          <w:sz w:val="18"/>
+        </w:rPr>
+        <w:t>237 characters</w:t>
+      </w:r>
+    </w:p>
+    <w:p>
+      <w:r>
+        <w:rPr>
+          <w:b/>
+        </w:rPr>
+        <w:t>Robb Justice  |  Director, Carrier Sales</w:t>
+      </w:r>
+    </w:p>
+    <w:p>
+      <w:r>
+        <w:t>https://www.linkedin.com/in/robb-justice-a5b79a8</w:t>
+      </w:r>
+    </w:p>
+    <w:p>
+      <w:r>
+        <w:t>Robb, heading to NANOG 97 in Bellevue next week -- Segra's fiber network in the Southeast is exactly the kind of infrastructure conversation NANOG is built for. Grabbing a beer Sunday night before things kick off. Would love to connect.</w:t>
+      </w:r>
+    </w:p>
+    <w:p>
+      <w:r>
+        <w:rPr>
+          <w:i/>
+          <w:sz w:val="18"/>
+        </w:rPr>
+        <w:t>236 characters</w:t>
+      </w:r>
+    </w:p>
+    <w:p>
+      <w:r>
+        <w:rPr>
+          <w:b/>
+        </w:rPr>
+        <w:t>Dave Kamphuis  |  Vice President, Carrier Sales</w:t>
+      </w:r>
+    </w:p>
+    <w:p>
+      <w:r>
+        <w:t>https://www.linkedin.com/in/dave-kamphuis-3955223</w:t>
+      </w:r>
+    </w:p>
+    <w:p>
+      <w:r>
+        <w:t>Dave, heading to NANOG 97 in Bellevue next week -- Segra's fiber network in the Southeast is exactly the kind of infrastructure conversation NANOG is built for. Grabbing a beer Sunday night before things kick off. Would love to connect.</w:t>
+      </w:r>
+    </w:p>
+    <w:p>
+      <w:r>
+        <w:rPr>
+          <w:i/>
+          <w:sz w:val="18"/>
+        </w:rPr>
+        <w:t>236 characters</w:t>
+      </w:r>
+    </w:p>
+    <w:p>
+      <w:r>
+        <w:rPr>
+          <w:b/>
+        </w:rPr>
+        <w:t>Blair Pierce  |  Hyperscale &amp; Wireline Sales</w:t>
+      </w:r>
+    </w:p>
+    <w:p>
+      <w:r>
+        <w:t>https://www.linkedin.com/in/blairpierce</w:t>
+      </w:r>
+    </w:p>
+    <w:p>
+      <w:r>
+        <w:t>Blair, heading to NANOG 97 in Bellevue next week -- Segra's fiber network in the Southeast is exactly the kind of infrastructure conversation NANOG is built for. Grabbing a beer Sunday night before things kick off. Would love to connect.</w:t>
+      </w:r>
+    </w:p>
+    <w:p>
+      <w:r>
+        <w:rPr>
+          <w:i/>
+          <w:sz w:val="18"/>
+        </w:rPr>
+        <w:t>237 characters</w:t>
+      </w:r>
+    </w:p>
+    <w:p>
+      <w:r>
+        <w:rPr>
+          <w:b/>
+        </w:rPr>
+        <w:t>Jennifer Windham  |  Carrier Account Director</w:t>
+      </w:r>
+    </w:p>
+    <w:p>
+      <w:r>
+        <w:t>https://www.linkedin.com/in/jenniferwindham</w:t>
+      </w:r>
+    </w:p>
+    <w:p>
+      <w:r>
+        <w:t>Jennifer, heading to NANOG 97 in Bellevue next week -- Segra's fiber network in the Southeast is exactly the kind of infrastructure conversation NANOG is built for. Grabbing a beer Sunday night before things kick off. Would love to connect.</w:t>
+      </w:r>
+    </w:p>
+    <w:p>
+      <w:r>
+        <w:rPr>
+          <w:i/>
+          <w:sz w:val="18"/>
+        </w:rPr>
+        <w:t>240 characters</w:t>
       </w:r>
     </w:p>
     <w:sectPr>

</xml_diff>